<commit_message>
Add row-order block designs as a second capture proxy (Concern 1)
- p6_arff_order.py: map every deduplicated flow to its row in the original
  Scenario A2 ARFF files; neighbouring rows are far more alike than random
  rows, so row order keeps captures together
- designs.py: ordered10/35/140, orderedcal (blocks = capture files) and
  orderedhalf (first vs second half of each class), 11 repeats, RF and XGB
- Result: gap stays at or above zero in every repeat (calibrated blocks
  XGB +0.074, RF +0.153; first/second half +0.033, +0.093)
- Paper v8: new method paragraph, Table VII rows, Fig. 7 and Fig. 2,
  abstract, VI-C, VI-F, VII, X-A, XI, XII and Table XV updated;
  response letter concern 1 extended; README updated
</commit_message>
<xml_diff>
--- a/paper/Response_to_Reviewer_v8.docx
+++ b/paper/Response_to_Reviewer_v8.docx
@@ -17,7 +17,7 @@
     </w:p>
     <w:p>
       <w:r>
-        <w:t>We thank the reviewer for another careful report. This revision adds a calibrated grouping design, block-summed SHAP shares with a conditional permutation check, a list-origin by target decomposition of the feature-list transfer, a family-share table and spreads for the class-mix swap. All revision history has been moved out of the manuscript and is collected at the end of this letter. Section and table numbers refer to the revised manuscript, which now has 15 tables and 8 figures.</w:t>
+        <w:t>We thank the reviewer for another careful report. This revision adds a calibrated grouping design, a second grouping proxy based on the row order of the original ARFF files, block-summed SHAP shares with a conditional permutation check, a list-origin by target decomposition of the feature-list transfer, a family-share table and spreads for the class-mix swap. All revision history has been moved out of the manuscript and is collected at the end of this letter. Section and table numbers refer to the revised manuscript, which now has 15 tables and 8 figures.</w:t>
       </w:r>
     </w:p>
     <w:p>
@@ -68,7 +68,17 @@
     </w:p>
     <w:p>
       <w:r>
-        <w:t>We agree that this is weak evidence and say so where the result is stated (abstract, Section VI-C, Section X-A and the conclusion): at the coarse and calibrated settings the half-models are weak and the gap varies widely between repeats. The abstract now says the mean gap is "close to zero, although the evidence at that setting is weak".</w:t>
+        <w:t>We agree that this is weak evidence: at the coarse and calibrated cluster settings the half-models are weak and the gap varies widely between repeats. Because clusters are built from the same features the models use, we also suspected that at coarse settings they separate regions of feature space rather than captures, so we added a second proxy that does not use the features.</w:t>
+      </w:r>
+    </w:p>
+    <w:p>
+      <w:r>
+        <w:t>Row-order blocks (Section IV-D, new paragraph "Row-order blocks"; Table VII; Fig. 7). In the original Scenario A2 ARFF files, flows are sorted by class and then kept in the order the flow meter wrote them. Every deduplicated flow in our data matches exactly one ARFF row, so its position is known. Neighbouring rows are much more alike than random rows of the same class (nearest of the 40 rows within 20 positions at 0.30–0.65 of the random distance, in every class and context), which suggests that flows of one capture sit together. We therefore formed halves from contiguous blocks of rows within each class: about 10, 35 and 140 flows per block, as many blocks as capture files, and the first versus the second half of each class. Under this proxy the half-models stay accurate, and the gap does not vanish: +0.074 for XGBoost and +0.153 for Random Forest with blocks calibrated to the capture counts, and +0.033 and +0.093 with the first-versus-second-half split, at or above zero in all 11 repeats for both models.</w:t>
+      </w:r>
+    </w:p>
+    <w:p>
+      <w:r>
+        <w:t>This changes the conclusion of the paper, and the abstract, Sections VI-C, VI-F, VII, X-A, XI and XII now report both proxies. The two disagree, and neither is a capture split: clusters may overcorrect, and blocks may undercorrect where a capture crosses a block boundary. Read together, they show that part of the random-split gap reflects related flows and that some excess probably remains. Its size cannot be pinned down without capture identifiers, and because the two contexts are different sets of captures it cannot be attributed to tunnelling. Splitting by capture file after regenerating flows from the raw PCAPs remains the way to settle it, and Section XI says so.</w:t>
       </w:r>
     </w:p>
     <w:p>
@@ -187,7 +197,7 @@
     </w:p>
     <w:p>
       <w:r>
-        <w:t>The abstract now says "the feature-level gap shrinks substantially", and Sections X-A and XII use the same scope. The family-level result is named in the summary of Section X-C.</w:t>
+        <w:t>The abstract now states the shrinkage only for the feature-level Spearman gap, and Sections X-A and XII use the same scope. The family-level result is named in the summary of Section X-C. Section VII also reports that under the row-order blocks the summed-family gaps stay positive for both models.</w:t>
       </w:r>
     </w:p>
     <w:p>
@@ -256,7 +266,7 @@
         <w:t xml:space="preserve">Abstract length. </w:t>
       </w:r>
       <w:r>
-        <w:t>Shortened from about 300 to about 210 words. It keeps the headline contrast (random halves, grouped halves with the calibrated setting, permutation null, model transfer and list transfer) and leaves the remaining numbers to the summary table, which is now Table XV.</w:t>
+        <w:t>Shortened from about 300 to about 225 words. It keeps the headline contrast (random halves, grouped halves with the calibrated setting, permutation null, model transfer and list transfer) and leaves the remaining numbers to the summary table, which is now Table XV.</w:t>
       </w:r>
     </w:p>
     <w:p>

</xml_diff>

<commit_message>
Align introduction, VI-F, methods wording and response letter with row-order result
</commit_message>
<xml_diff>
--- a/paper/Response_to_Reviewer_v8.docx
+++ b/paper/Response_to_Reviewer_v8.docx
@@ -83,7 +83,7 @@
     </w:p>
     <w:p>
       <w:r>
-        <w:t>The overcorrected sentences are gone. "They should not be read as an effect of the VPN" and similar wording are replaced by "cannot be attributed to tunnelling" throughout, and Sections VI-C and X-A note that the Random Forest gap is still positive in all 11 repeats at about 35 flows per cluster (0.042, minimum 0.015).</w:t>
+        <w:t>The overcorrected sentences are gone. "They should not be read as an effect of the VPN" and similar wording are replaced by "cannot be attributed to tunnelling" throughout, and Section VI-C notes that the Random Forest gap is still positive in all 11 repeats at about 35 flows per cluster (0.042, minimum 0.015).</w:t>
       </w:r>
     </w:p>
     <w:p>
@@ -197,7 +197,7 @@
     </w:p>
     <w:p>
       <w:r>
-        <w:t>The abstract now states the shrinkage only for the feature-level Spearman gap, and Sections X-A and XII use the same scope. The family-level result is named in the summary of Section X-C. Section VII also reports that under the row-order blocks the summed-family gaps stay positive for both models.</w:t>
+        <w:t>The abstract now states the shrinkage only for the Spearman gap between feature rankings, and Section XII calls it the feature-level gap. The family-level result is named in the summary of Section X-C. Section VII also reports that under the row-order blocks the summed-family gaps stay positive for both models.</w:t>
       </w:r>
     </w:p>
     <w:p>
@@ -266,7 +266,7 @@
         <w:t xml:space="preserve">Abstract length. </w:t>
       </w:r>
       <w:r>
-        <w:t>Shortened from about 300 to about 225 words. It keeps the headline contrast (random halves, grouped halves with the calibrated setting, permutation null, model transfer and list transfer) and leaves the remaining numbers to the summary table, which is now Table XV.</w:t>
+        <w:t>Shortened from about 300 to about 225 words. It keeps the headline contrast (random halves, the two grouping proxies, permutation null, model transfer and list transfer) and leaves the remaining numbers to the summary table, which is now Table XV.</w:t>
       </w:r>
     </w:p>
     <w:p>

</xml_diff>